<commit_message>
Add keyboard shortcuts for co-pilot.
</commit_message>
<xml_diff>
--- a/Documentation/DeveloperInformation.docx
+++ b/Documentation/DeveloperInformation.docx
@@ -47,7 +47,7 @@
         <w:rPr>
           <w:noProof/>
         </w:rPr>
-        <w:t>September 10, 2026</w:t>
+        <w:t>September 19, 2026</w:t>
       </w:r>
       <w:r>
         <w:rPr>
@@ -3683,7 +3683,7 @@
             <w:noProof/>
             <w:webHidden/>
           </w:rPr>
-          <w:t>23</w:t>
+          <w:t>24</w:t>
         </w:r>
         <w:r>
           <w:rPr>
@@ -3752,7 +3752,7 @@
             <w:noProof/>
             <w:webHidden/>
           </w:rPr>
-          <w:t>23</w:t>
+          <w:t>24</w:t>
         </w:r>
         <w:r>
           <w:rPr>
@@ -3890,7 +3890,7 @@
             <w:noProof/>
             <w:webHidden/>
           </w:rPr>
-          <w:t>24</w:t>
+          <w:t>25</w:t>
         </w:r>
         <w:r>
           <w:rPr>
@@ -3959,7 +3959,7 @@
             <w:noProof/>
             <w:webHidden/>
           </w:rPr>
-          <w:t>24</w:t>
+          <w:t>25</w:t>
         </w:r>
         <w:r>
           <w:rPr>
@@ -4028,7 +4028,7 @@
             <w:noProof/>
             <w:webHidden/>
           </w:rPr>
-          <w:t>24</w:t>
+          <w:t>25</w:t>
         </w:r>
         <w:r>
           <w:rPr>
@@ -18496,12 +18496,113 @@
     </w:p>
     <w:p>
       <w:pPr>
+        <w:pStyle w:val="StyleHang-MediumAfter0pt"/>
+      </w:pPr>
+    </w:p>
+    <w:p>
+      <w:pPr>
+        <w:pStyle w:val="Hang-Medium"/>
+        <w:spacing w:after="0"/>
+        <w:rPr>
+          <w:b/>
+          <w:bCs/>
+          <w:lang w:eastAsia="ar-SA"/>
+        </w:rPr>
+      </w:pPr>
+      <w:r>
+        <w:rPr>
+          <w:b/>
+          <w:bCs/>
+          <w:lang w:eastAsia="ar-SA"/>
+        </w:rPr>
+        <w:t>Copilot</w:t>
+      </w:r>
+    </w:p>
+    <w:p>
+      <w:pPr>
+        <w:pStyle w:val="StyleHang-MediumAfter0pt"/>
+      </w:pPr>
+      <w:r>
+        <w:t>Tab</w:t>
+      </w:r>
+      <w:r>
+        <w:tab/>
+        <w:t>Accept inline code suggestion</w:t>
+      </w:r>
+    </w:p>
+    <w:p>
+      <w:pPr>
+        <w:pStyle w:val="StyleHang-MediumAfter0pt"/>
+      </w:pPr>
+      <w:r>
+        <w:lastRenderedPageBreak/>
+        <w:t>Esc</w:t>
+      </w:r>
+      <w:r>
+        <w:tab/>
+        <w:t>Dismiss inline code suggestion</w:t>
+      </w:r>
+    </w:p>
+    <w:p>
+      <w:pPr>
+        <w:pStyle w:val="StyleHang-MediumAfter0pt"/>
+      </w:pPr>
+      <w:r>
+        <w:t xml:space="preserve">ALT </w:t>
+      </w:r>
+      <w:proofErr w:type="gramStart"/>
+      <w:r>
+        <w:t>+ ]</w:t>
+      </w:r>
+      <w:proofErr w:type="gramEnd"/>
+      <w:r>
+        <w:tab/>
+        <w:t>Show next suggestions</w:t>
+      </w:r>
+    </w:p>
+    <w:p>
+      <w:pPr>
+        <w:pStyle w:val="StyleHang-MediumAfter0pt"/>
+      </w:pPr>
+      <w:r>
+        <w:t>ALT + [</w:t>
+      </w:r>
+      <w:r>
+        <w:tab/>
+        <w:t>Show previous suggestion</w:t>
+      </w:r>
+    </w:p>
+    <w:p>
+      <w:pPr>
+        <w:pStyle w:val="StyleHang-MediumAfter0pt"/>
+      </w:pPr>
+      <w:r>
+        <w:t>ALT + \</w:t>
+      </w:r>
+      <w:r>
+        <w:tab/>
+        <w:t>Triggers a suggestion</w:t>
+      </w:r>
+    </w:p>
+    <w:p>
+      <w:pPr>
+        <w:pStyle w:val="StyleHang-MediumAfter0pt"/>
+      </w:pPr>
+      <w:r>
+        <w:t>Ctrl + Enter</w:t>
+      </w:r>
+      <w:r>
+        <w:tab/>
+        <w:t>Generate up to 10 suggestions in a separate pane</w:t>
+      </w:r>
+    </w:p>
+    <w:p>
+      <w:pPr>
         <w:pStyle w:val="Heading2"/>
       </w:pPr>
       <w:bookmarkStart w:id="70" w:name="_Toc239272868"/>
       <w:bookmarkStart w:id="71" w:name="_Toc227669205"/>
       <w:r>
-        <w:lastRenderedPageBreak/>
         <w:t>Node and NPM</w:t>
       </w:r>
       <w:bookmarkEnd w:id="70"/>
@@ -19134,6 +19235,7 @@
       <w:bookmarkStart w:id="74" w:name="_Toc239272871"/>
       <w:proofErr w:type="spellStart"/>
       <w:r>
+        <w:lastRenderedPageBreak/>
         <w:t>ESLint</w:t>
       </w:r>
       <w:bookmarkEnd w:id="74"/>
@@ -19278,7 +19380,6 @@
         </w:rPr>
       </w:pPr>
       <w:r>
-        <w:lastRenderedPageBreak/>
         <w:t xml:space="preserve">$ </w:t>
       </w:r>
       <w:proofErr w:type="spellStart"/>
@@ -19837,7 +19938,7 @@
         <w:szCs w:val="24"/>
         <w:lang w:eastAsia="en-US"/>
       </w:rPr>
-      <w:t>9</w:t>
+      <w:t>25</w:t>
     </w:r>
     <w:r>
       <w:rPr>
@@ -23828,7 +23929,7 @@
 </file>
 
 <file path=customXml/itemProps1.xml><?xml version="1.0" encoding="utf-8"?>
-<ds:datastoreItem xmlns:ds="http://schemas.openxmlformats.org/officeDocument/2006/customXml" ds:itemID="{975F1B5E-F3E8-42BF-B68C-EB8F8B16603F}">
+<ds:datastoreItem xmlns:ds="http://schemas.openxmlformats.org/officeDocument/2006/customXml" ds:itemID="{BD9A784F-0C30-4A6E-A410-E0190E062BFC}">
   <ds:schemaRefs>
     <ds:schemaRef ds:uri="http://schemas.openxmlformats.org/officeDocument/2006/bibliography"/>
   </ds:schemaRefs>

</xml_diff>